<commit_message>
tidied data cleaning pipeline
</commit_message>
<xml_diff>
--- a/writing/analysis_planning/Main and sensitivity analyses for wf and hospitalizations.docx
+++ b/writing/analysis_planning/Main and sensitivity analyses for wf and hospitalizations.docx
@@ -238,10 +238,7 @@
           </w:p>
           <w:p>
             <w:r>
-              <w:t>Untreated the same</w:t>
-            </w:r>
-            <w:r>
-              <w:t xml:space="preserve"> as in primary</w:t>
+              <w:t>Untreated the same as in primary</w:t>
             </w:r>
             <w:r>
               <w:t xml:space="preserve"> (0% exposed)</w:t>
@@ -415,7 +412,7 @@
           </w:tcPr>
           <w:p>
             <w:r>
-              <w:t xml:space="preserve"> - Restrict to the first wildfire a ZCTA experiences</w:t>
+              <w:t xml:space="preserve">If there is another exposure within 3 months of the first exposure, exclude that timeseries. </w:t>
             </w:r>
           </w:p>
         </w:tc>
@@ -449,16 +446,7 @@
           </w:tcPr>
           <w:p>
             <w:r>
-              <w:t>Do separate analyses for five-year periods</w:t>
-            </w:r>
-            <w:r>
-              <w:t xml:space="preserve"> (2000-2005, 2006-2010, </w:t>
-            </w:r>
-            <w:r>
-              <w:t>2010-2015, 2015-2018</w:t>
-            </w:r>
-            <w:r>
-              <w:t>).</w:t>
+              <w:t>Do separate analyses for five-year periods (2000-2005, 2006-2010, 2010-2015, 2015-2018).</w:t>
             </w:r>
           </w:p>
         </w:tc>

</xml_diff>